<commit_message>
Remove inline status-tag brackets from revised proposal, keep plain prose
</commit_message>
<xml_diff>
--- a/05_Supporting/UgaWildlifeVision_Proposal_REVISED.docx
+++ b/05_Supporting/UgaWildlifeVision_Proposal_REVISED.docx
@@ -145,7 +145,7 @@
           <w:b w:val="0"/>
           <w:i w:val="0"/>
         </w:rPr>
-        <w:t>This document is a revision of the GEC4101 proposal submitted in October 2026. It updates every section concerned with Part 1 — the annotated dataset and the lightweight detector (Specific Objectives (i)–(ii), Research Questions RQ1–RQ2) — to report what was actually built and found, now that Part 1 is complete and documented in a separate Capstone Project Report (Data-Efficient Wildlife Detection from Ugandan Field Footage, J. Walusimbi, October 2026) and in 05_Supporting/PROPOSAL_VS_DELIVERED.md of the project submission. Passages that report completed Part 1 work are marked [Part 1 – done] or [Part 1 – partly done]; unmarked or [Part 2 – proposed] passages are unchanged plans for the mobile application, which remains to be built.</w:t>
+        <w:t>This document is a revision of the GEC4101 proposal submitted in October 2026. It updates every section concerned with Part 1 — the annotated dataset and the lightweight detector (Specific Objectives (i)–(ii), Research Questions RQ1–RQ2) — to report what was actually built and found, now that Part 1 is complete and documented in a separate Capstone Project Report (Data-Efficient Wildlife Detection from Ugandan Field Footage, J. Walusimbi, October 2026) and in 05_Supporting/PROPOSAL_VS_DELIVERED.md of the project submission. Sections and paragraphs below describe, in plain text, what has already been completed for Part 1 and what remains proposed for Part 2, the mobile application, which is still to be built.</w:t>
       </w:r>
     </w:p>
     <w:p>
@@ -157,7 +157,7 @@
           <w:b w:val="0"/>
           <w:i w:val="0"/>
         </w:rPr>
-        <w:t>At the user's request, this revision also widens Part 2's local-language scope beyond the original plan: a voice mode that reads the local-language description aloud, and Runyankole alongside Luganda. These additions are marked [Part 2 – added in this revision] where they appear.</w:t>
+        <w:t>At the user's request, this revision also widens Part 2's local-language scope beyond the original plan: a voice mode that reads the local-language description aloud, and Runyankole alongside Luganda, throughout the relevant sections below.</w:t>
       </w:r>
     </w:p>
     <w:p>
@@ -337,36 +337,15 @@
     </w:p>
     <w:p>
       <w:r>
-        <w:rPr>
-          <w:b/>
-          <w:color w:val="1A6B1A"/>
-        </w:rPr>
-        <w:t xml:space="preserve">[Part 1 – done] </w:t>
-      </w:r>
-      <w:r>
         <w:t>UgaWildlifeVision is a two-part project, and Part 1 is now complete. Part 1 delivered an annotated image dataset of seven Ugandan wildlife classes (antelope, bird, chimpanzee, elephant, gorilla, hippopotamus and hog), built not by collecting new online images as originally planned but by auditing and correcting the existing NESTLER Wild Animal Recognition Video Dataset (Zenodo, doi:10.5281/zenodo.17036940): 1,220 annotated frames (3,909 boxes) across nine recording sessions, well short of the roughly 5,000 images originally targeted. A YOLOv8-nano detector fine-tuned on this corrected dataset reached a test mAP@0.5 of 0.71 (short of the 85% target) and exports to a 12 MB ONNX model running at about 13 ms per image on a desktop CPU; standard data augmentation was the only data-efficiency technique that clearly helped, and detection on recording sessions unseen in training was shown to be poor, meaning the normal test score overstates real-world performance.</w:t>
       </w:r>
     </w:p>
     <w:p>
       <w:r>
-        <w:rPr>
-          <w:b/>
-          <w:color w:val="1A6B1A"/>
-        </w:rPr>
-        <w:t xml:space="preserve">[Part 2 – proposed] </w:t>
-      </w:r>
-      <w:r>
         <w:t>Part 2 remains to be built: a mobile application that lets a tourist take or upload a photograph and receive, for each animal detected, a bounding box, the species name and a confidence score, shown through an augmented-reality (AR) overlay and accompanied by a written description in Luganda or Runyankole, with an optional voice mode that reads the description aloud. Comparison of the detector against YOLO11 and SSD-MobileNet baselines and export to TensorFlow Lite, left undone in Part 1, are carried forward into Part 2, together with a curated, linguist-validated Luganda and Runyankole knowledge base and voice content. The application will be evaluated technically (latency, calibration) and with users (System Usability Scale, task success, comprehension and voice-output clarity in both languages).</w:t>
       </w:r>
     </w:p>
     <w:p>
-      <w:r>
-        <w:rPr>
-          <w:b/>
-          <w:color w:val="1A6B1A"/>
-        </w:rPr>
-        <w:t xml:space="preserve">[Status] </w:t>
-      </w:r>
       <w:r>
         <w:t>Part 1's outcomes are a documented, corrected dataset and a benchmarked lightweight detection model, reported in full in the accompanying project report. Part 2's expected outcome is a working, multilingual, voice-enabled AR application. Together these should improve the visitor experience, support conservation education and extend language technology to Luganda and Runyankole.</w:t>
       </w:r>
@@ -861,13 +840,6 @@
     </w:p>
     <w:p>
       <w:r>
-        <w:rPr>
-          <w:b/>
-          <w:color w:val="1A6B1A"/>
-        </w:rPr>
-        <w:t xml:space="preserve">[Status] </w:t>
-      </w:r>
-      <w:r>
         <w:t>Part 1 of this objective — the annotated dataset and a benchmarked detector — has been achieved, with the differences from the original plan set out below. Part 2 — the mobile recognition system with bilingual, voice-enabled AR output — remains to be delivered.</w:t>
       </w:r>
     </w:p>
@@ -881,26 +853,12 @@
     </w:p>
     <w:p>
       <w:r>
-        <w:rPr>
-          <w:b/>
-          <w:color w:val="1A6B1A"/>
-        </w:rPr>
-        <w:t xml:space="preserve">[Objective (i) – Part 1, done] </w:t>
-      </w:r>
-      <w:r>
-        <w:t>To audit and correct the existing dataset of seven classes (antelope, bird, chimpanzee, elephant, gorilla, hippopotamus and hog), rather than collect new images online as originally planned. Auditing the nine-session NESTLER archive found 1,220 annotated frames (3,909 boxes) — not the 1,173 frames stated in the Zenodo record — and revealed that gorillas and chimpanzees had been merged under one 'monkey' label, which was corrected session by session. No new online images were collected; the roughly 700-images-per-class, 5,000-image target was not reached, and per-class totals range from 131 boxes (elephant) to 1,219 boxes (hippopotamus). The corrected dataset is documented in the accompanying project report rather than a separate datasheet.</w:t>
+        <w:t>(i) To audit and correct the existing dataset of seven classes (antelope, bird, chimpanzee, elephant, gorilla, hippopotamus and hog), rather than collect new images online as originally planned. Auditing the nine-session NESTLER archive found 1,220 annotated frames (3,909 boxes) — not the 1,173 frames stated in the Zenodo record — and revealed that gorillas and chimpanzees had been merged under one 'monkey' label, which was corrected session by session. No new online images were collected; the roughly 700-images-per-class, 5,000-image target was not reached, and per-class totals range from 131 boxes (elephant) to 1,219 boxes (hippopotamus). The corrected dataset is documented in the accompanying project report rather than a separate datasheet.</w:t>
       </w:r>
     </w:p>
     <w:p>
       <w:r>
-        <w:rPr>
-          <w:b/>
-          <w:color w:val="1A6B1A"/>
-        </w:rPr>
-        <w:t xml:space="preserve">[Objective (ii) – Part 1, done] </w:t>
-      </w:r>
-      <w:r>
-        <w:t>To train and select a lightweight detector. A YOLOv8-nano model (comparison against YOLO11 or SSD-MobileNet variants was not carried out) was fine-tuned on the corrected 7-class dataset and selected after a five-step data-efficiency ablation (no augmentation; standard augmentation; copy-paste; class-imbalance handling; pseudo-labelling), of which only standard augmentation gave a clear, reproducible gain. The selected model reached a test mAP@0.5 of 0.71 — short of the 85% target — and exports to a 12 MB ONNX file running at about 13 ms per image on a desktop CPU; it has not been converted to TensorFlow Lite or timed on an Android phone. A leave-session-out check showed that performance collapses on recording sessions never seen in training (gorilla test mAP50 0.77→0.15; hippo 0.97→0.06), so even an 85% result on the standard split would have overstated real-world performance.</w:t>
+        <w:t>(ii) To train and select a lightweight detector. A YOLOv8-nano model (comparison against YOLO11 or SSD-MobileNet variants was not carried out) was fine-tuned on the corrected 7-class dataset and selected after a five-step data-efficiency ablation (no augmentation; standard augmentation; copy-paste; class-imbalance handling; pseudo-labelling), of which only standard augmentation gave a clear, reproducible gain. The selected model reached a test mAP@0.5 of 0.71 — short of the 85% target — and exports to a 12 MB ONNX file running at about 13 ms per image on a desktop CPU; it has not been converted to TensorFlow Lite or timed on an Android phone. A leave-session-out check showed that performance collapses on recording sessions never seen in training (gorilla test mAP50 0.77→0.15; hippo 0.97→0.06), so even an 85% result on the standard split would have overstated real-world performance.</w:t>
       </w:r>
     </w:p>
     <w:p>
@@ -941,13 +899,6 @@
     </w:p>
     <w:p>
       <w:r>
-        <w:rPr>
-          <w:b/>
-          <w:color w:val="1A6B1A"/>
-        </w:rPr>
-        <w:t xml:space="preserve">[Status] </w:t>
-      </w:r>
-      <w:r>
         <w:t>Objectives (i) and (ii) — Part 1 — are complete, as summarised above and detailed in the accompanying Capstone Project Report. Objectives (iii) to (v) — Part 2, with voice output and Runyankole added in this revision — remain to be carried out, using the Part 1 model as their starting point.</w:t>
       </w:r>
     </w:p>
@@ -973,13 +924,6 @@
     </w:p>
     <w:p>
       <w:r>
-        <w:rPr>
-          <w:b/>
-          <w:color w:val="1A6B1A"/>
-        </w:rPr>
-        <w:t xml:space="preserve">[RQ1 – Part 1, done] </w:t>
-      </w:r>
-      <w:r>
         <w:t>Answered: a representative dataset did not need new volume. Auditing and correctly splitting the existing 1,220-frame, nine-session archive — including a format-aware fix for padded chimpanzee footage, giving 849 training, 180 validation and 191 test images — is what mattered; overall volume stayed far below the 5,000-image target, and the smallest class (elephant) has only 131 boxes.</w:t>
       </w:r>
     </w:p>
@@ -997,13 +941,6 @@
     </w:p>
     <w:p>
       <w:r>
-        <w:rPr>
-          <w:b/>
-          <w:color w:val="1A6B1A"/>
-        </w:rPr>
-        <w:t xml:space="preserve">[RQ2 – Part 1, done] </w:t>
-      </w:r>
-      <w:r>
         <w:t>Partly answered: among the options actually tried, YOLOv8-nano with standard augmentation gave the best balance of accuracy and simplicity (test mAP50 0.71); calibration and on-phone speed were not measured. Generalisation to unseen recording sessions was measured and is poor (gorilla 0.77→0.15; hippo 0.97→0.06 test mAP50), the clearest finding of Part 1.</w:t>
       </w:r>
     </w:p>
@@ -1113,26 +1050,12 @@
     </w:p>
     <w:p>
       <w:r>
-        <w:rPr>
-          <w:b/>
-          <w:color w:val="1A6B1A"/>
-        </w:rPr>
-        <w:t xml:space="preserve">[(a) – Part 1, done] </w:t>
-      </w:r>
-      <w:r>
-        <w:t>auditing and relabelling the existing dataset of seven classes (antelope, bird, chimpanzee, elephant, gorilla, hippopotamus and hog). In the delivered dataset, antelope, bird and hog were not expanded into the full group-class diversity originally planned (Appendix D): antelope covers the Uganda kob only (visually confirmed), and bird and hog cover whatever the existing footage contained.</w:t>
+        <w:t>(a) auditing and relabelling the existing dataset of seven classes (antelope, bird, chimpanzee, elephant, gorilla, hippopotamus and hog) — complete. In the delivered dataset, antelope, bird and hog were not expanded into the full group-class diversity originally planned (Appendix D): antelope covers the Uganda kob only (visually confirmed), and bird and hog cover whatever the existing footage contained.</w:t>
       </w:r>
     </w:p>
     <w:p>
       <w:r>
-        <w:rPr>
-          <w:b/>
-          <w:color w:val="1A6B1A"/>
-        </w:rPr>
-        <w:t xml:space="preserve">[(b) – Part 1, partly done] </w:t>
-      </w:r>
-      <w:r>
-        <w:t>training and benchmarking a lightweight detector; it was exported to ONNX, not to TensorFlow Lite as planned — TFLite export and benchmarking are carried forward into Part 2.</w:t>
+        <w:t>(b) training and benchmarking a lightweight detector — complete, but exported to ONNX, not to TensorFlow Lite as planned; TFLite export and benchmarking are carried forward into Part 2.</w:t>
       </w:r>
     </w:p>
     <w:p>
@@ -1144,7 +1067,7 @@
           <w:b w:val="0"/>
           <w:i w:val="0"/>
         </w:rPr>
-        <w:t>(c) [Part 2, proposed] an Android application with image capture and upload, bounding boxes, species name, confidence score, AR overlay, and Luganda/Runyankole text with an optional voice playback of that text;</w:t>
+        <w:t>(c) an Android application with image capture and upload, bounding boxes, species name, confidence score, AR overlay, and Luganda/Runyankole text with an optional voice playback of that text — proposed;</w:t>
       </w:r>
     </w:p>
     <w:p>
@@ -1156,7 +1079,7 @@
           <w:b w:val="0"/>
           <w:i w:val="0"/>
         </w:rPr>
-        <w:t>(d) [Part 2, proposed] a validated Luganda and Runyankole knowledge base, including voice content; and</w:t>
+        <w:t>(d) a validated Luganda and Runyankole knowledge base, including voice content — proposed; and</w:t>
       </w:r>
     </w:p>
     <w:p>
@@ -1168,7 +1091,7 @@
           <w:b w:val="0"/>
           <w:i w:val="0"/>
         </w:rPr>
-        <w:t>(e) [Part 2, proposed] technical and user evaluation of the application, in addition to the Part 1 technical evaluation of the dataset and detector already completed (Chapter 3).</w:t>
+        <w:t>(e) technical and user evaluation of the application, in addition to the Part 1 technical evaluation of the dataset and detector already completed (Chapter 3) — proposed.</w:t>
       </w:r>
     </w:p>
     <w:p>
@@ -1205,13 +1128,6 @@
     </w:p>
     <w:p>
       <w:r>
-        <w:rPr>
-          <w:b/>
-          <w:color w:val="1A6B1A"/>
-        </w:rPr>
-        <w:t xml:space="preserve">[Status] </w:t>
-      </w:r>
-      <w:r>
         <w:t>Part 1 needed no new data collection: the existing dataset's own session folders held more usable frames (1,220) than its published description stated (1,173), so the online collection plan above was not carried out. It remains available for Part 2 if further images are later needed.</w:t>
       </w:r>
     </w:p>
@@ -1249,13 +1165,6 @@
     </w:p>
     <w:p>
       <w:r>
-        <w:rPr>
-          <w:b/>
-          <w:color w:val="1A6B1A"/>
-        </w:rPr>
-        <w:t xml:space="preserve">[Status] </w:t>
-      </w:r>
-      <w:r>
         <w:t>Part 1's dataset-audit, model-training and evaluation work (Table A.1, activities 3, 4 and 6) is complete, ahead of the schedule below; Part 2's activities remain on the original timeline.</w:t>
       </w:r>
     </w:p>
@@ -1349,13 +1258,6 @@
       </w:r>
     </w:p>
     <w:p>
-      <w:r>
-        <w:rPr>
-          <w:b/>
-          <w:color w:val="1A6B1A"/>
-        </w:rPr>
-        <w:t xml:space="preserve">[Status] </w:t>
-      </w:r>
       <w:r>
         <w:t>Part 1's leave-session-out and new-video checks are a direct, worked example of this: a detector scoring 0.71–0.97 test mAP50 on a standard split fell to 0.06–0.15 on sessions it had never seen, confirming that domain shift, not just raw accuracy, is the binding constraint for this kind of dataset.</w:t>
       </w:r>
@@ -2033,13 +1935,6 @@
     </w:p>
     <w:p>
       <w:r>
-        <w:rPr>
-          <w:b/>
-          <w:color w:val="1A6B1A"/>
-        </w:rPr>
-        <w:t xml:space="preserve">[Status] </w:t>
-      </w:r>
-      <w:r>
         <w:t>Part 1 narrowed, but did not close, gap (1): it produced a corrected, documented 7-class dataset and a benchmarked detector from the existing field-footage archive (not new tourist-style images), reported in the accompanying project report, and quantified how far test-set accuracy overstates performance on unseen footage. Gaps (2)–(4) are unaffected and remain Part 2's targets.</w:t>
       </w:r>
     </w:p>
@@ -2085,13 +1980,6 @@
     </w:p>
     <w:p>
       <w:r>
-        <w:rPr>
-          <w:b/>
-          <w:color w:val="1A6B1A"/>
-        </w:rPr>
-        <w:t xml:space="preserve">[Status] </w:t>
-      </w:r>
-      <w:r>
         <w:t>Part 1 tested the first link in this chain (dataset quality → detection performance, RQ1–RQ2) directly: it found that split design and session diversity, more than raw image count, governed performance, and that performance drops sharply when capture conditions (an unseen session) fall outside what the moderators in the figure anticipate. The remaining links (RQ3–RQ5) are Part 2's to test.</w:t>
       </w:r>
     </w:p>
@@ -2142,13 +2030,6 @@
     </w:p>
     <w:p>
       <w:r>
-        <w:rPr>
-          <w:b/>
-          <w:color w:val="1A6B1A"/>
-        </w:rPr>
-        <w:t xml:space="preserve">[Status] </w:t>
-      </w:r>
-      <w:r>
         <w:t>For Part 1, design-and-development and evaluation were completed for the dataset and model (the project report serves as that cycle's communication step); demonstration and user evaluation were not applicable, since there was no application yet. Part 2 carries out the remaining DSR activities for the application.</w:t>
       </w:r>
     </w:p>
@@ -2181,17 +2062,10 @@
           <w:b w:val="0"/>
           <w:i/>
         </w:rPr>
-        <w:t>[Figure 3.1, as implemented for Part 1 / still proposed for Part 2] Offline development pipeline: existing dataset → label audit and correction (done; CVAT was not used) → UgaWildlifeVision dataset (YOLO/COCO format, done) → training and benchmarking (YOLOv8-nano only, done; YOLO11/baseline comparison not done) → ONNX model (done; quantised TFLite export not done). On-device mobile application (Part 2, proposed): input (camera capture or gallery upload) → pre-processing and TFLite detector → post-processing (NMS, confidence threshold) → species and Luganda/Runyankole knowledge base with voice clips (local file) → AR overlay and result screen (box, name, score, text and voice-playback button).</w:t>
+        <w:t>Offline development pipeline, as implemented for Part 1: existing dataset → label audit and correction (CVAT was not used) → UgaWildlifeVision dataset (YOLO/COCO format) → training and benchmarking (YOLOv8-nano only; no YOLO11/baseline comparison) → ONNX model (not a quantised TFLite export). On-device mobile application, still proposed for Part 2: input (camera capture or gallery upload) → pre-processing and TFLite detector → post-processing (NMS, confidence threshold) → species and Luganda/Runyankole knowledge base with voice clips (local file) → AR overlay and result screen (box, name, score, text and voice-playback button).</w:t>
       </w:r>
     </w:p>
     <w:p>
-      <w:r>
-        <w:rPr>
-          <w:b/>
-          <w:color w:val="1A6B1A"/>
-        </w:rPr>
-        <w:t xml:space="preserve">[Status] </w:t>
-      </w:r>
       <w:r>
         <w:t>Part 1 implemented the left-hand half of this pipeline with three differences from the plan: the existing dataset's annotations were audited and corrected in place (fixing the merged gorilla/chimpanzee 'monkey' label) rather than re-drawn in CVAT; only YOLOv8-nano was fine-tuned and benchmarked, not YOLO11 or an SSD-MobileNet baseline; and the selected model was exported to ONNX rather than a quantised TensorFlow Lite model. The on-device mobile application (right-hand half of the figure) is unbuilt and remains Part 2.</w:t>
       </w:r>
@@ -2230,13 +2104,6 @@
     </w:p>
     <w:p>
       <w:r>
-        <w:rPr>
-          <w:b/>
-          <w:color w:val="1A6B1A"/>
-        </w:rPr>
-        <w:t xml:space="preserve">[Status] </w:t>
-      </w:r>
-      <w:r>
         <w:t>The data-collection-and-annotation and model-development sprints are complete (Part 1, reported in the project report); the application-development, integration, user-evaluation and release sprints (Part 2, now including voice-mode and Runyankole work) have not started.</w:t>
       </w:r>
     </w:p>
@@ -2262,13 +2129,6 @@
     </w:p>
     <w:p>
       <w:r>
-        <w:rPr>
-          <w:b/>
-          <w:color w:val="1A6B1A"/>
-        </w:rPr>
-        <w:t xml:space="preserve">[Status] </w:t>
-      </w:r>
-      <w:r>
         <w:t>This elicitation work is Part 2 and had not started when Part 1 closed; no interviews, questionnaires or photograph reviews described above have yet been carried out.</w:t>
       </w:r>
     </w:p>
@@ -2294,13 +2154,6 @@
     </w:p>
     <w:p>
       <w:r>
-        <w:rPr>
-          <w:b/>
-          <w:color w:val="1A6B1A"/>
-        </w:rPr>
-        <w:t xml:space="preserve">[Part 1 – done] </w:t>
-      </w:r>
-      <w:r>
         <w:t>The existing dataset — the NESTLER Wild Animal Recognition Video Dataset on Zenodo, doi:10.5281/zenodo.17036940, CC BY 4.0 — was audited (images and boxes per class, formats, sources, duplicates) and converted to YOLO format. The audit found 1,220 image files across the nine session folders, more than the 1,173 frames stated in the dataset's own description, and all 1,220 were used; no gap required new images, so the online-collection plan described below was not carried out. The seven target classes totalled 3,909 boxes, ranging from 131 (elephant) to 1,219 (hippopotamus) — an imbalance of about 9 to 1 — well short of the roughly 5,000-image, 8,000-box target. The audit also found that the source annotations recorded gorillas and chimpanzees under one shared ‘monkey’ category; because each session shows only one of the two species, every such box was relabelled from its session folder to recover the species-level label.</w:t>
       </w:r>
     </w:p>
@@ -2330,24 +2183,10 @@
     </w:p>
     <w:p>
       <w:r>
-        <w:rPr>
-          <w:b/>
-          <w:color w:val="1A6B1A"/>
-        </w:rPr>
-        <w:t xml:space="preserve">[Part 1 – done, differs from plan] </w:t>
-      </w:r>
-      <w:r>
         <w:t>Each of the nine sessions was cut in time order into 70% training, 15% validation and 15% test, rather than holding out whole sessions as the main split (whole-session holdout was used only as a separate generalisation check, Experiment A, below). A first attempt showed that the chimpanzee video's late, portrait-format footage — padded with blurred bars — fell entirely into validation and test; the fix detected and cropped the padded frames and split the two formats separately. The corrected split produced 849 training, 180 validation and 191 test images. No second-annotator pass, IoU/Cohen's kappa agreement check, or per-image capture metadata (location, date, time of day, distance class, device) was carried out, since the images were audited and corrected rather than newly annotated from scratch.</w:t>
       </w:r>
     </w:p>
     <w:p>
-      <w:r>
-        <w:rPr>
-          <w:b/>
-          <w:color w:val="1A6B1A"/>
-        </w:rPr>
-        <w:t xml:space="preserve">[Part 1 – added, done] </w:t>
-      </w:r>
       <w:r>
         <w:t>An additional leave-session-out check, not in the original plan (Experiment A), trained on three sessions only and tested on two sessions withheld entirely, to measure performance on footage the detector had never seen. This showed a severe drop (gorilla test mAP50 0.77 to 0.15; hippo 0.97 to 0.06), discussed further in Section 3.9 and the Capstone Project Report, Section 4.4.</w:t>
       </w:r>
@@ -2863,13 +2702,6 @@
       </w:r>
     </w:p>
     <w:p>
-      <w:r>
-        <w:rPr>
-          <w:b/>
-          <w:color w:val="1A6B1A"/>
-        </w:rPr>
-        <w:t xml:space="preserve">[Part 1 – done, differs from plan] </w:t>
-      </w:r>
       <w:r>
         <w:t>Dataset statistics (images and boxes per class) were reported in the project report. Annotation quality was not assessed by IoU or Cohen's kappa, since annotations were audited and corrected rather than newly drawn. Detection performance was reported as precision, recall, per-class AP, mAP@0.5 and mAP@0.5:0.95, with confusion matrices drawn at a fixed 0.25 confidence threshold — the Ultralytics default of 0.001 was found to be misleading and was not used — and as three-seed means and standard deviations rather than bootstrap confidence intervals. Calibration (reliability diagrams, expected calibration error) was not measured. Robustness was analysed by comparing standard test performance against two unseen-session holdouts (gorilla, hippo) and four held-out videos, rather than by distance, occlusion and light subsets as planned; efficiency was reported as ONNX model size and CPU/GPU latency on one desktop PC, not on a test phone.</w:t>
       </w:r>
@@ -3423,26 +3255,12 @@
     </w:p>
     <w:p>
       <w:r>
-        <w:rPr>
-          <w:b/>
-          <w:color w:val="1A6B1A"/>
-        </w:rPr>
-        <w:t xml:space="preserve">[Dataset – Part 1, done] </w:t>
-      </w:r>
-      <w:r>
-        <w:t>The audited dataset's completeness, class balance and absence of duplicate frames across splits were checked and are reported in the project report; a separate published datasheet was not produced.</w:t>
+        <w:t>Dataset: the audited dataset's completeness, class balance and absence of duplicate frames across splits were checked and are reported in the project report; a separate published datasheet was not produced.</w:t>
       </w:r>
     </w:p>
     <w:p>
       <w:r>
-        <w:rPr>
-          <w:b/>
-          <w:color w:val="1A6B1A"/>
-        </w:rPr>
-        <w:t xml:space="preserve">[Model – Part 1, done, differs from plan] </w:t>
-      </w:r>
-      <w:r>
-        <w:t>The single candidate detector (YOLOv8-nano) was evaluated on the held-out test set by mAP, per-class AP, precision, recall and a confusion matrix at a fixed confidence threshold, with model size and latency before and after ONNX export. Robustness was checked via two leave-session-out holdouts and four held-out videos rather than distance/occlusion/light subsets, and error analysis covered look-alike confusions, small/distant animals and vegetation occlusion — confirming that misses and false alarms, not species mix-ups, dominate the errors.</w:t>
+        <w:t>Model: the single candidate detector (YOLOv8-nano) was evaluated on the held-out test set by mAP, per-class AP, precision, recall and a confusion matrix at a fixed confidence threshold, with model size and latency before and after ONNX export. Robustness was checked via two leave-session-out holdouts and four held-out videos rather than distance/occlusion/light subsets, and error analysis covered look-alike confusions, small/distant animals and vegetation occlusion — confirming that misses and false alarms, not species mix-ups, dominate the errors.</w:t>
       </w:r>
     </w:p>
     <w:tbl>
@@ -3831,7 +3649,7 @@
           <w:b w:val="0"/>
           <w:i w:val="0"/>
         </w:rPr>
-        <w:t>Application (proposed, Part 2): functional tests for each requirement (including offline operation and the non-AR fallback); AR tests of overlay alignment and stability; voice-mode tests of playback latency and audibility; a device test on held-out tourist-style images and live camera input, recording correct identifications, response time and problems; and a usability test with about 20 participants (tourists, Ugandan visitors, guides, students, including both Luganda and Runyankole speakers) who complete defined tasks and answer the SUS and TAM questionnaire, while native speakers of each language rate the text and voice output.</w:t>
+        <w:t>Application (still proposed for Part 2): functional tests for each requirement (including offline operation and the non-AR fallback); AR tests of overlay alignment and stability; voice-mode tests of playback latency and audibility; a device test on held-out tourist-style images and live camera input, recording correct identifications, response time and problems; and a usability test with about 20 participants (tourists, Ugandan visitors, guides, students, including both Luganda and Runyankole speakers) who complete defined tasks and answer the SUS and TAM questionnaire, while native speakers of each language rate the text and voice output.</w:t>
       </w:r>
     </w:p>
     <w:p>
@@ -3851,13 +3669,6 @@
       </w:r>
     </w:p>
     <w:p>
-      <w:r>
-        <w:rPr>
-          <w:b/>
-          <w:color w:val="1A6B1A"/>
-        </w:rPr>
-        <w:t xml:space="preserve">[Status] </w:t>
-      </w:r>
       <w:r>
         <w:t>No new images were collected for Part 1, so the licensing and GPS-removal safeguards below were not exercised: all Part 1 data came from the existing, already openly licensed (CC BY 4.0) Zenodo archive, which itself carries no GPS or park-location metadata. No human participants were involved in Part 1; the safeguards below remain the plan for Part 2's interviews, questionnaires and usability testing.</w:t>
       </w:r>
@@ -4529,13 +4340,6 @@
     </w:p>
     <w:p>
       <w:r>
-        <w:rPr>
-          <w:b/>
-          <w:color w:val="1A6B1A"/>
-        </w:rPr>
-        <w:t xml:space="preserve">[Status] </w:t>
-      </w:r>
-      <w:r>
         <w:t>The dataset audit, correction, splitting, model training, ablation and technical evaluation described above are complete and reported in full in the accompanying Capstone Project Report. The Luganda and Runyankole knowledge base, voice mode, mobile application and user evaluation remain to be carried out as described above.</w:t>
       </w:r>
     </w:p>
@@ -4565,13 +4369,6 @@
       </w:r>
     </w:p>
     <w:p>
-      <w:r>
-        <w:rPr>
-          <w:b/>
-          <w:color w:val="1A6B1A"/>
-        </w:rPr>
-        <w:t xml:space="preserve">[Part 1 – done] </w:t>
-      </w:r>
       <w:r>
         <w:t>Part 1 is complete. It delivered an annotated, corrected dataset of seven Ugandan wildlife classes (antelope, bird, chimpanzee, elephant, gorilla, hippopotamus and hog) from the existing NESTLER archive — 1,220 frames, 3,909 boxes — and a fine-tuned YOLOv8-nano detector reaching 0.71 test mAP@0.5, exported to a 12 MB ONNX model. Three findings matter most: fixing a flawed time-based split raised chimpanzee mAP50 from 0.14 to 0.67; standard data augmentation was the one technique, among five tried, that clearly helped (+0.10 test mAP50), while copy-paste, class-imbalance handling and pseudo-labelling gave no clear further gain; and detection on recording sessions unseen in training collapsed (gorilla 0.77→0.15, hippo 0.97→0.06), showing that a normal test score overstates real-world performance. Bird detection remains essentially unsolved (test mAP50 about 0.03). Full results, methods and limitations are in the accompanying Capstone Project Report.</w:t>
       </w:r>
@@ -5859,13 +5656,6 @@
       </w:r>
     </w:p>
     <w:p>
-      <w:r>
-        <w:rPr>
-          <w:b/>
-          <w:color w:val="1A6B1A"/>
-        </w:rPr>
-        <w:t xml:space="preserve">[Status] </w:t>
-      </w:r>
       <w:r>
         <w:t>M1 and the dataset-audit part of M2 are done. The dataset was frozen at 1,220 images (not the 3,500/5,000 planned for M2/M3) because the audit found no gap that required new images, and the baseline detector (YOLOv8-nano, test mAP50 0.71) is selected and ONNX-exported rather than TFLite-exported. M3's Luganda validation, M5 and M6 remain to be done, now also covering Runyankole and the voice mode.</w:t>
       </w:r>
@@ -6747,13 +6537,6 @@
       </w:r>
     </w:p>
     <w:p>
-      <w:r>
-        <w:rPr>
-          <w:b/>
-          <w:color w:val="1A6B1A"/>
-        </w:rPr>
-        <w:t xml:space="preserve">[Status] </w:t>
-      </w:r>
       <w:r>
         <w:t>Items 1, 3 and 5 as budgeted were not spent for Part 1: training used an available GPU rather than a cloud subscription, and no new annotation or storage spend was needed once the audit showed the existing archive was sufficient. Items 2, 4, 6 and 7 remain relevant to Part 2. Voice output (added in this revision) is assumed to add no new budget line, since the plan is to record or generate audio for the same small, fixed vocabulary the language specialists are already validating as text; a separate item should be added only if professional recording equipment or studio time is needed.</w:t>
       </w:r>

</xml_diff>